<commit_message>
hw2 q2 data set
</commit_message>
<xml_diff>
--- a/data_mining/839/hw2.docx
+++ b/data_mining/839/hw2.docx
@@ -3589,7 +3589,7 @@
                 </mc:Choice>
                 <mc:Fallback>
                   <w:pict>
-                    <v:oval w14:anchorId="31638D9D" id="Oval 2" o:spid="_x0000_s1026" style="position:absolute;margin-left:70.5pt;margin-top:-.2pt;width:60.65pt;height:16pt;z-index:251678720;visibility:visible;mso-wrap-style:square;mso-width-percent:0;mso-height-percent:0;mso-wrap-distance-left:9pt;mso-wrap-distance-top:0;mso-wrap-distance-right:9pt;mso-wrap-distance-bottom:0;mso-position-horizontal:absolute;mso-position-horizontal-relative:text;mso-position-vertical:absolute;mso-position-vertical-relative:text;mso-width-percent:0;mso-height-percent:0;mso-width-relative:margin;mso-height-relative:margin;v-text-anchor:middle" o:gfxdata="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" filled="f" strokecolor="red" strokeweight="1pt">
+                    <v:oval w14:anchorId="22EAAB4D" id="Oval 2" o:spid="_x0000_s1026" style="position:absolute;margin-left:70.5pt;margin-top:-.2pt;width:60.65pt;height:16pt;z-index:251678720;visibility:visible;mso-wrap-style:square;mso-width-percent:0;mso-height-percent:0;mso-wrap-distance-left:9pt;mso-wrap-distance-top:0;mso-wrap-distance-right:9pt;mso-wrap-distance-bottom:0;mso-position-horizontal:absolute;mso-position-horizontal-relative:text;mso-position-vertical:absolute;mso-position-vertical-relative:text;mso-width-percent:0;mso-height-percent:0;mso-width-relative:margin;mso-height-relative:margin;v-text-anchor:middle" o:gfxdata="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" filled="f" strokecolor="red" strokeweight="1pt">
                       <v:stroke joinstyle="miter"/>
                     </v:oval>
                   </w:pict>
@@ -3669,7 +3669,7 @@
                 </mc:Choice>
                 <mc:Fallback>
                   <w:pict>
-                    <v:oval w14:anchorId="32142223" id="Oval 1" o:spid="_x0000_s1026" style="position:absolute;margin-left:-6.6pt;margin-top:13.8pt;width:77.3pt;height:18pt;z-index:251679744;visibility:visible;mso-wrap-style:square;mso-width-percent:0;mso-wrap-distance-left:9pt;mso-wrap-distance-top:0;mso-wrap-distance-right:9pt;mso-wrap-distance-bottom:0;mso-position-horizontal:absolute;mso-position-horizontal-relative:text;mso-position-vertical:absolute;mso-position-vertical-relative:text;mso-width-percent:0;mso-width-relative:margin;v-text-anchor:middle" o:gfxdata="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" filled="f" strokecolor="red" strokeweight="1pt">
+                    <v:oval w14:anchorId="44A0FECD" id="Oval 1" o:spid="_x0000_s1026" style="position:absolute;margin-left:-6.6pt;margin-top:13.8pt;width:77.3pt;height:18pt;z-index:251679744;visibility:visible;mso-wrap-style:square;mso-width-percent:0;mso-wrap-distance-left:9pt;mso-wrap-distance-top:0;mso-wrap-distance-right:9pt;mso-wrap-distance-bottom:0;mso-position-horizontal:absolute;mso-position-horizontal-relative:text;mso-position-vertical:absolute;mso-position-vertical-relative:text;mso-width-percent:0;mso-width-relative:margin;v-text-anchor:middle" o:gfxdata="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" filled="f" strokecolor="red" strokeweight="1pt">
                       <v:stroke joinstyle="miter"/>
                     </v:oval>
                   </w:pict>
@@ -4167,7 +4167,7 @@
                 </mc:Choice>
                 <mc:Fallback>
                   <w:pict>
-                    <v:oval w14:anchorId="0229B647" id="Oval 4" o:spid="_x0000_s1026" style="position:absolute;margin-left:-5.75pt;margin-top:.35pt;width:29.35pt;height:14.65pt;z-index:251680768;visibility:visible;mso-wrap-style:square;mso-width-percent:0;mso-height-percent:0;mso-wrap-distance-left:9pt;mso-wrap-distance-top:0;mso-wrap-distance-right:9pt;mso-wrap-distance-bottom:0;mso-position-horizontal:absolute;mso-position-horizontal-relative:text;mso-position-vertical:absolute;mso-position-vertical-relative:text;mso-width-percent:0;mso-height-percent:0;mso-width-relative:margin;mso-height-relative:margin;v-text-anchor:middle" o:gfxdata="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" filled="f" strokecolor="red" strokeweight="1pt">
+                    <v:oval w14:anchorId="6366E07E" id="Oval 4" o:spid="_x0000_s1026" style="position:absolute;margin-left:-5.75pt;margin-top:.35pt;width:29.35pt;height:14.65pt;z-index:251680768;visibility:visible;mso-wrap-style:square;mso-width-percent:0;mso-height-percent:0;mso-wrap-distance-left:9pt;mso-wrap-distance-top:0;mso-wrap-distance-right:9pt;mso-wrap-distance-bottom:0;mso-position-horizontal:absolute;mso-position-horizontal-relative:text;mso-position-vertical:absolute;mso-position-vertical-relative:text;mso-width-percent:0;mso-height-percent:0;mso-width-relative:margin;mso-height-relative:margin;v-text-anchor:middle" o:gfxdata="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" filled="f" strokecolor="red" strokeweight="1pt">
                       <v:stroke joinstyle="miter"/>
                     </v:oval>
                   </w:pict>
@@ -5625,6 +5625,566 @@
               </w:rPr>
               <w:t>no</w:t>
             </w:r>
+          </w:p>
+        </w:tc>
+      </w:tr>
+    </w:tbl>
+    <w:p>
+      <w:pPr>
+        <w:rPr>
+          <w:lang w:val="en-US"/>
+        </w:rPr>
+      </w:pPr>
+    </w:p>
+    <w:p>
+      <w:pPr>
+        <w:rPr>
+          <w:lang w:val="en-US"/>
+        </w:rPr>
+      </w:pPr>
+      <w:r>
+        <w:rPr>
+          <w:lang w:val="en-US"/>
+        </w:rPr>
+        <w:t>Temperature cutpoints: 97, 99</w:t>
+      </w:r>
+      <w:r>
+        <w:rPr>
+          <w:lang w:val="en-US"/>
+        </w:rPr>
+        <w:t>.</w:t>
+      </w:r>
+    </w:p>
+    <w:tbl>
+      <w:tblPr>
+        <w:tblStyle w:val="TableGrid"/>
+        <w:tblW w:w="0" w:type="auto"/>
+        <w:tblLook w:val="04A0" w:firstRow="1" w:lastRow="0" w:firstColumn="1" w:lastColumn="0" w:noHBand="0" w:noVBand="1"/>
+      </w:tblPr>
+      <w:tblGrid>
+        <w:gridCol w:w="2122"/>
+        <w:gridCol w:w="1701"/>
+        <w:gridCol w:w="5187"/>
+      </w:tblGrid>
+      <w:tr>
+        <w:tc>
+          <w:tcPr>
+            <w:tcW w:w="2122" w:type="dxa"/>
+          </w:tcPr>
+          <w:p>
+            <w:pPr>
+              <w:rPr>
+                <w:lang w:val="en-US"/>
+              </w:rPr>
+            </w:pPr>
+            <w:r>
+              <w:rPr>
+                <w:lang w:val="en-US"/>
+              </w:rPr>
+              <w:t>(a, v)</w:t>
+            </w:r>
+          </w:p>
+        </w:tc>
+        <w:tc>
+          <w:tcPr>
+            <w:tcW w:w="1701" w:type="dxa"/>
+          </w:tcPr>
+          <w:p>
+            <w:pPr>
+              <w:rPr>
+                <w:lang w:val="en-US"/>
+              </w:rPr>
+            </w:pPr>
+            <w:r>
+              <w:rPr>
+                <w:lang w:val="en-US"/>
+              </w:rPr>
+              <w:t>[(a, v)]</w:t>
+            </w:r>
+          </w:p>
+        </w:tc>
+        <w:tc>
+          <w:tcPr>
+            <w:tcW w:w="5187" w:type="dxa"/>
+          </w:tcPr>
+          <w:p>
+            <w:pPr>
+              <w:rPr>
+                <w:lang w:val="en-US"/>
+              </w:rPr>
+            </w:pPr>
+          </w:p>
+        </w:tc>
+      </w:tr>
+      <w:tr>
+        <w:tc>
+          <w:tcPr>
+            <w:tcW w:w="2122" w:type="dxa"/>
+          </w:tcPr>
+          <w:p>
+            <w:pPr>
+              <w:rPr>
+                <w:lang w:val="en-US"/>
+              </w:rPr>
+            </w:pPr>
+            <w:r>
+              <w:rPr>
+                <w:lang w:val="en-US"/>
+              </w:rPr>
+              <w:t>[(Temp, 96..97)]</w:t>
+            </w:r>
+          </w:p>
+        </w:tc>
+        <w:tc>
+          <w:tcPr>
+            <w:tcW w:w="1701" w:type="dxa"/>
+          </w:tcPr>
+          <w:p>
+            <w:pPr>
+              <w:rPr>
+                <w:lang w:val="en-US"/>
+              </w:rPr>
+            </w:pPr>
+            <w:r>
+              <w:rPr>
+                <w:lang w:val="en-US"/>
+              </w:rPr>
+              <w:t>{6, 7, 8}</w:t>
+            </w:r>
+          </w:p>
+        </w:tc>
+        <w:tc>
+          <w:tcPr>
+            <w:tcW w:w="5187" w:type="dxa"/>
+          </w:tcPr>
+          <w:p>
+            <w:pPr>
+              <w:rPr>
+                <w:lang w:val="en-US"/>
+              </w:rPr>
+            </w:pPr>
+          </w:p>
+        </w:tc>
+      </w:tr>
+      <w:tr>
+        <w:tc>
+          <w:tcPr>
+            <w:tcW w:w="2122" w:type="dxa"/>
+          </w:tcPr>
+          <w:p>
+            <w:pPr>
+              <w:rPr>
+                <w:lang w:val="en-US"/>
+              </w:rPr>
+            </w:pPr>
+            <w:r>
+              <w:rPr>
+                <w:lang w:val="en-US"/>
+              </w:rPr>
+              <w:t>[(Temp, 9</w:t>
+            </w:r>
+            <w:r>
+              <w:rPr>
+                <w:lang w:val="en-US"/>
+              </w:rPr>
+              <w:t>7</w:t>
+            </w:r>
+            <w:r>
+              <w:rPr>
+                <w:lang w:val="en-US"/>
+              </w:rPr>
+              <w:t>..</w:t>
+            </w:r>
+            <w:r>
+              <w:rPr>
+                <w:lang w:val="en-US"/>
+              </w:rPr>
+              <w:t>100</w:t>
+            </w:r>
+            <w:r>
+              <w:rPr>
+                <w:lang w:val="en-US"/>
+              </w:rPr>
+              <w:t>)]</w:t>
+            </w:r>
+          </w:p>
+        </w:tc>
+        <w:tc>
+          <w:tcPr>
+            <w:tcW w:w="1701" w:type="dxa"/>
+          </w:tcPr>
+          <w:p>
+            <w:pPr>
+              <w:rPr>
+                <w:lang w:val="en-US"/>
+              </w:rPr>
+            </w:pPr>
+            <w:r>
+              <w:rPr>
+                <w:lang w:val="en-US"/>
+              </w:rPr>
+              <w:t>{1, 2, 4, 5, 8}</w:t>
+            </w:r>
+          </w:p>
+        </w:tc>
+        <w:tc>
+          <w:tcPr>
+            <w:tcW w:w="5187" w:type="dxa"/>
+          </w:tcPr>
+          <w:p>
+            <w:pPr>
+              <w:rPr>
+                <w:lang w:val="en-US"/>
+              </w:rPr>
+            </w:pPr>
+          </w:p>
+        </w:tc>
+      </w:tr>
+      <w:tr>
+        <w:tc>
+          <w:tcPr>
+            <w:tcW w:w="2122" w:type="dxa"/>
+          </w:tcPr>
+          <w:p>
+            <w:pPr>
+              <w:rPr>
+                <w:lang w:val="en-US"/>
+              </w:rPr>
+            </w:pPr>
+            <w:r>
+              <w:rPr>
+                <w:lang w:val="en-US"/>
+              </w:rPr>
+              <w:t>[(Temp, 96..</w:t>
+            </w:r>
+            <w:r>
+              <w:rPr>
+                <w:lang w:val="en-US"/>
+              </w:rPr>
+              <w:t>99</w:t>
+            </w:r>
+            <w:r>
+              <w:rPr>
+                <w:lang w:val="en-US"/>
+              </w:rPr>
+              <w:t>)]</w:t>
+            </w:r>
+          </w:p>
+        </w:tc>
+        <w:tc>
+          <w:tcPr>
+            <w:tcW w:w="1701" w:type="dxa"/>
+          </w:tcPr>
+          <w:p>
+            <w:pPr>
+              <w:rPr>
+                <w:lang w:val="en-US"/>
+              </w:rPr>
+            </w:pPr>
+            <w:r>
+              <w:rPr>
+                <w:lang w:val="en-US"/>
+              </w:rPr>
+              <w:t>{1, 4, 5, 6, 7, 8}</w:t>
+            </w:r>
+          </w:p>
+        </w:tc>
+        <w:tc>
+          <w:tcPr>
+            <w:tcW w:w="5187" w:type="dxa"/>
+          </w:tcPr>
+          <w:p>
+            <w:pPr>
+              <w:rPr>
+                <w:lang w:val="en-US"/>
+              </w:rPr>
+            </w:pPr>
+          </w:p>
+        </w:tc>
+      </w:tr>
+      <w:tr>
+        <w:tc>
+          <w:tcPr>
+            <w:tcW w:w="2122" w:type="dxa"/>
+          </w:tcPr>
+          <w:p>
+            <w:pPr>
+              <w:rPr>
+                <w:lang w:val="en-US"/>
+              </w:rPr>
+            </w:pPr>
+            <w:r>
+              <w:rPr>
+                <w:lang w:val="en-US"/>
+              </w:rPr>
+              <w:t>[(Temp, 9</w:t>
+            </w:r>
+            <w:r>
+              <w:rPr>
+                <w:lang w:val="en-US"/>
+              </w:rPr>
+              <w:t>99</w:t>
+            </w:r>
+            <w:r>
+              <w:rPr>
+                <w:lang w:val="en-US"/>
+              </w:rPr>
+              <w:t>..100)]</w:t>
+            </w:r>
+          </w:p>
+        </w:tc>
+        <w:tc>
+          <w:tcPr>
+            <w:tcW w:w="1701" w:type="dxa"/>
+          </w:tcPr>
+          <w:p>
+            <w:pPr>
+              <w:rPr>
+                <w:lang w:val="en-US"/>
+              </w:rPr>
+            </w:pPr>
+            <w:r>
+              <w:rPr>
+                <w:lang w:val="en-US"/>
+              </w:rPr>
+              <w:t>{2, 8}</w:t>
+            </w:r>
+          </w:p>
+        </w:tc>
+        <w:tc>
+          <w:tcPr>
+            <w:tcW w:w="5187" w:type="dxa"/>
+          </w:tcPr>
+          <w:p>
+            <w:pPr>
+              <w:rPr>
+                <w:lang w:val="en-US"/>
+              </w:rPr>
+            </w:pPr>
+          </w:p>
+        </w:tc>
+      </w:tr>
+      <w:tr>
+        <w:tc>
+          <w:tcPr>
+            <w:tcW w:w="2122" w:type="dxa"/>
+          </w:tcPr>
+          <w:p>
+            <w:pPr>
+              <w:rPr>
+                <w:lang w:val="en-US"/>
+              </w:rPr>
+            </w:pPr>
+            <w:r>
+              <w:rPr>
+                <w:lang w:val="en-US"/>
+              </w:rPr>
+              <w:t>[(Headache, yes)]</w:t>
+            </w:r>
+          </w:p>
+        </w:tc>
+        <w:tc>
+          <w:tcPr>
+            <w:tcW w:w="1701" w:type="dxa"/>
+          </w:tcPr>
+          <w:p>
+            <w:pPr>
+              <w:rPr>
+                <w:lang w:val="en-US"/>
+              </w:rPr>
+            </w:pPr>
+            <w:r>
+              <w:rPr>
+                <w:lang w:val="en-US"/>
+              </w:rPr>
+              <w:t>{2, 4, 5, 6, 8}</w:t>
+            </w:r>
+          </w:p>
+        </w:tc>
+        <w:tc>
+          <w:tcPr>
+            <w:tcW w:w="5187" w:type="dxa"/>
+          </w:tcPr>
+          <w:p>
+            <w:pPr>
+              <w:rPr>
+                <w:lang w:val="en-US"/>
+              </w:rPr>
+            </w:pPr>
+          </w:p>
+        </w:tc>
+      </w:tr>
+      <w:tr>
+        <w:tc>
+          <w:tcPr>
+            <w:tcW w:w="2122" w:type="dxa"/>
+          </w:tcPr>
+          <w:p>
+            <w:pPr>
+              <w:rPr>
+                <w:lang w:val="en-US"/>
+              </w:rPr>
+            </w:pPr>
+            <w:r>
+              <w:rPr>
+                <w:lang w:val="en-US"/>
+              </w:rPr>
+              <w:t xml:space="preserve">[(Headache, </w:t>
+            </w:r>
+            <w:r>
+              <w:rPr>
+                <w:lang w:val="en-US"/>
+              </w:rPr>
+              <w:t>no</w:t>
+            </w:r>
+            <w:r>
+              <w:rPr>
+                <w:lang w:val="en-US"/>
+              </w:rPr>
+              <w:t>)]</w:t>
+            </w:r>
+          </w:p>
+        </w:tc>
+        <w:tc>
+          <w:tcPr>
+            <w:tcW w:w="1701" w:type="dxa"/>
+          </w:tcPr>
+          <w:p>
+            <w:pPr>
+              <w:rPr>
+                <w:lang w:val="en-US"/>
+              </w:rPr>
+            </w:pPr>
+            <w:r>
+              <w:rPr>
+                <w:lang w:val="en-US"/>
+              </w:rPr>
+              <w:t>{3, 7}</w:t>
+            </w:r>
+          </w:p>
+        </w:tc>
+        <w:tc>
+          <w:tcPr>
+            <w:tcW w:w="5187" w:type="dxa"/>
+          </w:tcPr>
+          <w:p>
+            <w:pPr>
+              <w:rPr>
+                <w:lang w:val="en-US"/>
+              </w:rPr>
+            </w:pPr>
+          </w:p>
+        </w:tc>
+      </w:tr>
+      <w:tr>
+        <w:tc>
+          <w:tcPr>
+            <w:tcW w:w="2122" w:type="dxa"/>
+          </w:tcPr>
+          <w:p>
+            <w:pPr>
+              <w:rPr>
+                <w:lang w:val="en-US"/>
+              </w:rPr>
+            </w:pPr>
+            <w:r>
+              <w:rPr>
+                <w:lang w:val="en-US"/>
+              </w:rPr>
+              <w:t>[(Nausea, yes)]</w:t>
+            </w:r>
+          </w:p>
+        </w:tc>
+        <w:tc>
+          <w:tcPr>
+            <w:tcW w:w="1701" w:type="dxa"/>
+          </w:tcPr>
+          <w:p>
+            <w:pPr>
+              <w:rPr>
+                <w:lang w:val="en-US"/>
+              </w:rPr>
+            </w:pPr>
+            <w:r>
+              <w:rPr>
+                <w:lang w:val="en-US"/>
+              </w:rPr>
+              <w:t>{2, 4, 5, 7, 8}</w:t>
+            </w:r>
+          </w:p>
+        </w:tc>
+        <w:tc>
+          <w:tcPr>
+            <w:tcW w:w="5187" w:type="dxa"/>
+          </w:tcPr>
+          <w:p>
+            <w:pPr>
+              <w:rPr>
+                <w:lang w:val="en-US"/>
+              </w:rPr>
+            </w:pPr>
+          </w:p>
+        </w:tc>
+      </w:tr>
+      <w:tr>
+        <w:tc>
+          <w:tcPr>
+            <w:tcW w:w="2122" w:type="dxa"/>
+          </w:tcPr>
+          <w:p>
+            <w:pPr>
+              <w:rPr>
+                <w:lang w:val="en-US"/>
+              </w:rPr>
+            </w:pPr>
+            <w:r>
+              <w:rPr>
+                <w:lang w:val="en-US"/>
+              </w:rPr>
+              <w:t xml:space="preserve">[(Nausea, </w:t>
+            </w:r>
+            <w:r>
+              <w:rPr>
+                <w:lang w:val="en-US"/>
+              </w:rPr>
+              <w:t>no</w:t>
+            </w:r>
+            <w:r>
+              <w:rPr>
+                <w:lang w:val="en-US"/>
+              </w:rPr>
+              <w:t>)]</w:t>
+            </w:r>
+          </w:p>
+        </w:tc>
+        <w:tc>
+          <w:tcPr>
+            <w:tcW w:w="1701" w:type="dxa"/>
+          </w:tcPr>
+          <w:p>
+            <w:pPr>
+              <w:rPr>
+                <w:lang w:val="en-US"/>
+              </w:rPr>
+            </w:pPr>
+            <w:r>
+              <w:rPr>
+                <w:lang w:val="en-US"/>
+              </w:rPr>
+              <w:t>{1, 3, 6, 8}</w:t>
+            </w:r>
+          </w:p>
+        </w:tc>
+        <w:tc>
+          <w:tcPr>
+            <w:tcW w:w="5187" w:type="dxa"/>
+          </w:tcPr>
+          <w:p>
+            <w:pPr>
+              <w:rPr>
+                <w:lang w:val="en-US"/>
+              </w:rPr>
+            </w:pPr>
           </w:p>
         </w:tc>
       </w:tr>

</xml_diff>